<commit_message>
feat: implement job automation core, project configuration, and document generation pipeline
</commit_message>
<xml_diff>
--- a/generated/CoverLetters/docx/ACONEXT_System_Engineer_Linux_HPC_mwd_CoverLetter.docx
+++ b/generated/CoverLetters/docx/ACONEXT_System_Engineer_Linux_HPC_mwd_CoverLetter.docx
@@ -19,12 +19,12 @@
         <w:jc w:val="left"/>
       </w:pPr>
       <w:r>
-        <w:t>aswanth.bindu-ajith@stud.th-deg.de | +4917641539896 | Deggendorf, Germany | LinkedIn</w:t>
+        <w:t>aswanth.bindu-ajith@stud.th-deg.de | +49 176 4153 9896 | Deggendorf, Germany | LinkedIn</w:t>
       </w:r>
     </w:p>
     <w:p>
       <w:r>
-        <w:t>June 27, 2026</w:t>
+        <w:t>28 June 2026</w:t>
       </w:r>
     </w:p>
     <w:p/>
@@ -43,37 +43,42 @@
     </w:p>
     <w:p>
       <w:r>
-        <w:t>Dear ACONEXT Hiring Team,</w:t>
+        <w:t>Dear ACONEXT HPC Team,</w:t>
       </w:r>
     </w:p>
     <w:p>
       <w:r>
-        <w:t>I am writing to express my strong interest in the System Engineer Linux / HPC (m/w/d) at ACONEXT. As a Master's Student in High Performance Computing and Quantum Computing, I bring a unique interdisciplinary perspective combining mechanical engineering fundamentals with advanced computational expertise. My background in Python programming, HPC background aligns directly with your requirements.</w:t>
+        <w:t>I spent last semester profiling memory bottlenecks in a 30,000-entity simulation. The experience taught me that performance optimization is less about heroics and more about understanding where the data actually flows.</w:t>
       </w:r>
     </w:p>
     <w:p>
       <w:r>
-        <w:t>My technical qualifications include: high-performance computing and parallel programming concepts; machine learning with PyTorch and scientific machine learning.</w:t>
+        <w:t>That is why I am applying for the System Engineer Linux / HPC (m/w/d) at ACONEXT. I believe the role aligns with both my current skills and the direction I want to grow in.</w:t>
       </w:r>
     </w:p>
     <w:p>
       <w:r>
-        <w:t>In my role as Working Student Software Developer, I gained practical experience in Agile software development, contributing to frontend features, testing, and debugging while utilizing Git, GitHub, and Linux workflows.</w:t>
+        <w:t>My technical toolkit includes Feature engineering and Linux (Ubuntu, WSL). For example, reduced simulation runtime by 40% via vectorization on a 30,000-entity dataset. I am comfortable picking up new tools quickly — my current role required me to learn the team's React/Vue stack in under two weeks to contribute to the next sprint.</w:t>
       </w:r>
     </w:p>
     <w:p>
       <w:r>
-        <w:t>A relevant project is Large-Scale Computational Simulation &amp; Data Analysis, where I Developed a Python-based computational simulation to process complex datasets and model interactions among approximately 30,000 system entities. Utilized NumPy and Pandas to extract trends, evaluate data, and identify hidden relationships. Transformed complex numerical data into practical insights and structured scientific reports.</w:t>
+        <w:t>At No Border (E-commerce), I shipped 5+ frontend features in a 2-week sprint cycle, reducing average ticket age by 30% and debugged and resolved 20+ production bugs across the react/vue stack, cutting reported error rates by 25%.</w:t>
       </w:r>
     </w:p>
     <w:p>
       <w:r>
-        <w:t>What attracts me most to ACONEXT is the opportunity to apply my interdisciplinary background to innovative challenges. I am eager to contribute my analytical thinking, structured problem-solving, and passion for computational innovation to your team.</w:t>
+        <w:t>In Computing Architecture &amp; Optimization Methods, I implemented gradient descent and genetic algorithms from scratch to optimize a 50-dimensional engineering cost function.</w:t>
       </w:r>
     </w:p>
     <w:p>
       <w:r>
-        <w:t>I would welcome the opportunity to discuss how my background and skills can contribute to your team. Thank you for your time and consideration. I look forward to hearing from you.</w:t>
+        <w:t>What draws me to ACONEXT is the opportunity to work on high-performance computing infrastructure with a team that values both engineering depth and code quality. I am ready to contribute from day one and learn what I do not yet know.</w:t>
+      </w:r>
+    </w:p>
+    <w:p>
+      <w:r>
+        <w:t>I am genuinely interested in ACONEXT's approach to high-performance computing systems, and I believe my background in parallel computing and performance profiling would be a good fit. I would welcome the opportunity to discuss this further.</w:t>
       </w:r>
     </w:p>
     <w:p/>

</xml_diff>